<commit_message>
Historia de usuario 7
</commit_message>
<xml_diff>
--- a/TP2. E4 Sprint Backlog con tareas y estimaciones.docx
+++ b/TP2. E4 Sprint Backlog con tareas y estimaciones.docx
@@ -1188,7 +1188,7 @@
     <w:sdt>
       <w:sdtPr>
         <w:lock w:val="contentLocked"/>
-        <w:id w:val="383287268"/>
+        <w:id w:val="147229462"/>
         <w:tag w:val="goog_rdk_0"/>
       </w:sdtPr>
       <w:sdtContent>
@@ -1516,7 +1516,7 @@
     <w:sdt>
       <w:sdtPr>
         <w:lock w:val="contentLocked"/>
-        <w:id w:val="-722296295"/>
+        <w:id w:val="911158144"/>
         <w:tag w:val="goog_rdk_1"/>
       </w:sdtPr>
       <w:sdtContent>
@@ -3232,7 +3232,7 @@
         <w:rPr>
           <w:rtl w:val="0"/>
         </w:rPr>
-        <w:t xml:space="preserve"> Como usuario deseo poder rastrear el origen de cada muestra dispensada.</w:t>
+        <w:t xml:space="preserve"> Como usuario deseo poder rastrear el origen de cada muestra dispensada por cada paciente.</w:t>
       </w:r>
     </w:p>
     <w:p>
@@ -3623,7 +3623,7 @@
         <w:rPr>
           <w:rtl w:val="0"/>
         </w:rPr>
-        <w:t xml:space="preserve"> Como usuario deseo generar códigos de trazabilidad únicos.</w:t>
+        <w:t xml:space="preserve"> Como usuario deseo generar códigos de trazabilidad únicos para cada leche.</w:t>
       </w:r>
     </w:p>
     <w:p>
@@ -3926,7 +3926,7 @@
         <w:rPr>
           <w:rtl w:val="0"/>
         </w:rPr>
-        <w:t xml:space="preserve">Sprint 4: Modulo de dispensación</w:t>
+        <w:t xml:space="preserve">Sprint 4: Modulo de Pacientes</w:t>
       </w:r>
     </w:p>
     <w:p>
@@ -3976,7 +3976,7 @@
     <w:sdt>
       <w:sdtPr>
         <w:lock w:val="contentLocked"/>
-        <w:id w:val="-2135749130"/>
+        <w:id w:val="-247824351"/>
         <w:tag w:val="goog_rdk_2"/>
       </w:sdtPr>
       <w:sdtContent>
@@ -4376,7 +4376,7 @@
     <w:sdt>
       <w:sdtPr>
         <w:lock w:val="contentLocked"/>
-        <w:id w:val="-989313764"/>
+        <w:id w:val="160547431"/>
         <w:tag w:val="goog_rdk_3"/>
       </w:sdtPr>
       <w:sdtContent>
@@ -4780,7 +4780,7 @@
     <w:sdt>
       <w:sdtPr>
         <w:lock w:val="contentLocked"/>
-        <w:id w:val="-1473455766"/>
+        <w:id w:val="1876830169"/>
         <w:tag w:val="goog_rdk_4"/>
       </w:sdtPr>
       <w:sdtContent>
@@ -5139,13 +5139,20 @@
     </w:p>
     <w:p>
       <w:pPr>
-        <w:rPr/>
-      </w:pPr>
-      <w:r>
-        <w:rPr>
-          <w:rtl w:val="0"/>
-        </w:rPr>
-        <w:t xml:space="preserve">Sprint 5: Modulo de donanates</w:t>
+        <w:rPr>
+          <w:b w:val="1"/>
+          <w:sz w:val="32"/>
+          <w:szCs w:val="32"/>
+        </w:rPr>
+      </w:pPr>
+      <w:r>
+        <w:rPr>
+          <w:b w:val="1"/>
+          <w:sz w:val="32"/>
+          <w:szCs w:val="32"/>
+          <w:rtl w:val="0"/>
+        </w:rPr>
+        <w:t xml:space="preserve">Sprint 5: Modulo de donantes</w:t>
       </w:r>
       <w:r>
         <w:rPr>
@@ -5211,7 +5218,7 @@
     <w:sdt>
       <w:sdtPr>
         <w:lock w:val="contentLocked"/>
-        <w:id w:val="224933036"/>
+        <w:id w:val="-1191347806"/>
         <w:tag w:val="goog_rdk_5"/>
       </w:sdtPr>
       <w:sdtContent>
@@ -5615,7 +5622,7 @@
     <w:sdt>
       <w:sdtPr>
         <w:lock w:val="contentLocked"/>
-        <w:id w:val="1855428592"/>
+        <w:id w:val="-1514538586"/>
         <w:tag w:val="goog_rdk_6"/>
       </w:sdtPr>
       <w:sdtContent>
@@ -6024,7 +6031,7 @@
     <w:sdt>
       <w:sdtPr>
         <w:lock w:val="contentLocked"/>
-        <w:id w:val="-934345823"/>
+        <w:id w:val="1602816481"/>
         <w:tag w:val="goog_rdk_7"/>
       </w:sdtPr>
       <w:sdtContent>
@@ -6430,7 +6437,7 @@
     <w:sdt>
       <w:sdtPr>
         <w:lock w:val="contentLocked"/>
-        <w:id w:val="868698563"/>
+        <w:id w:val="1771178557"/>
         <w:tag w:val="goog_rdk_8"/>
       </w:sdtPr>
       <w:sdtContent>
@@ -6823,7 +6830,7 @@
     <w:sdt>
       <w:sdtPr>
         <w:lock w:val="contentLocked"/>
-        <w:id w:val="-487616987"/>
+        <w:id w:val="-1941732701"/>
         <w:tag w:val="goog_rdk_9"/>
       </w:sdtPr>
       <w:sdtContent>
@@ -7250,7 +7257,7 @@
     <w:sdt>
       <w:sdtPr>
         <w:lock w:val="contentLocked"/>
-        <w:id w:val="1136823778"/>
+        <w:id w:val="1447942161"/>
         <w:tag w:val="goog_rdk_10"/>
       </w:sdtPr>
       <w:sdtContent>
@@ -7654,7 +7661,7 @@
     <w:sdt>
       <w:sdtPr>
         <w:lock w:val="contentLocked"/>
-        <w:id w:val="-276615945"/>
+        <w:id w:val="-1604676774"/>
         <w:tag w:val="goog_rdk_11"/>
       </w:sdtPr>
       <w:sdtContent>
@@ -8058,7 +8065,7 @@
     <w:sdt>
       <w:sdtPr>
         <w:lock w:val="contentLocked"/>
-        <w:id w:val="-1359568988"/>
+        <w:id w:val="232308030"/>
         <w:tag w:val="goog_rdk_12"/>
       </w:sdtPr>
       <w:sdtContent>

</xml_diff>

<commit_message>
Historia de usuario 7 backend
</commit_message>
<xml_diff>
--- a/TP2. E4 Sprint Backlog con tareas y estimaciones.docx
+++ b/TP2. E4 Sprint Backlog con tareas y estimaciones.docx
@@ -1188,7 +1188,7 @@
     <w:sdt>
       <w:sdtPr>
         <w:lock w:val="contentLocked"/>
-        <w:id w:val="147229462"/>
+        <w:id w:val="-1034249842"/>
         <w:tag w:val="goog_rdk_0"/>
       </w:sdtPr>
       <w:sdtContent>
@@ -1516,7 +1516,7 @@
     <w:sdt>
       <w:sdtPr>
         <w:lock w:val="contentLocked"/>
-        <w:id w:val="911158144"/>
+        <w:id w:val="566303641"/>
         <w:tag w:val="goog_rdk_1"/>
       </w:sdtPr>
       <w:sdtContent>
@@ -2842,7 +2842,7 @@
         <w:rPr>
           <w:rtl w:val="0"/>
         </w:rPr>
-        <w:t xml:space="preserve"> Como usuario deseo registrar cada dispensación de leche con detalles del receptor.</w:t>
+        <w:t xml:space="preserve"> Como usuario deseo registrar cada dispensación de leche por toma en la base de datos.</w:t>
       </w:r>
     </w:p>
     <w:p>
@@ -3209,7 +3209,7 @@
         <w:rPr>
           <w:rtl w:val="0"/>
         </w:rPr>
-        <w:t xml:space="preserve">Rastrear origen de la leche</w:t>
+        <w:t xml:space="preserve">Rastrear destino de la leche dispensada.</w:t>
       </w:r>
       <w:r>
         <w:rPr>
@@ -3232,7 +3232,7 @@
         <w:rPr>
           <w:rtl w:val="0"/>
         </w:rPr>
-        <w:t xml:space="preserve"> Como usuario deseo poder rastrear el origen de cada muestra dispensada por cada paciente.</w:t>
+        <w:t xml:space="preserve"> Como usuario, deseo poder rastrear el destino de la leche mediante su código en la base de datos.</w:t>
       </w:r>
     </w:p>
     <w:p>
@@ -3623,7 +3623,7 @@
         <w:rPr>
           <w:rtl w:val="0"/>
         </w:rPr>
-        <w:t xml:space="preserve"> Como usuario deseo generar códigos de trazabilidad únicos para cada leche.</w:t>
+        <w:t xml:space="preserve"> Como usuario deseo generar códigos de trazabilidad únicos para cada dispensación que se registren en la base de datos.</w:t>
       </w:r>
     </w:p>
     <w:p>
@@ -3920,10 +3920,13 @@
     </w:p>
     <w:p>
       <w:pPr>
-        <w:rPr/>
-      </w:pPr>
-      <w:r>
-        <w:rPr>
+        <w:rPr>
+          <w:b w:val="1"/>
+        </w:rPr>
+      </w:pPr>
+      <w:r>
+        <w:rPr>
+          <w:b w:val="1"/>
           <w:rtl w:val="0"/>
         </w:rPr>
         <w:t xml:space="preserve">Sprint 4: Modulo de Pacientes</w:t>
@@ -3976,7 +3979,7 @@
     <w:sdt>
       <w:sdtPr>
         <w:lock w:val="contentLocked"/>
-        <w:id w:val="-247824351"/>
+        <w:id w:val="607839740"/>
         <w:tag w:val="goog_rdk_2"/>
       </w:sdtPr>
       <w:sdtContent>
@@ -4376,7 +4379,7 @@
     <w:sdt>
       <w:sdtPr>
         <w:lock w:val="contentLocked"/>
-        <w:id w:val="160547431"/>
+        <w:id w:val="1020419410"/>
         <w:tag w:val="goog_rdk_3"/>
       </w:sdtPr>
       <w:sdtContent>
@@ -4780,7 +4783,7 @@
     <w:sdt>
       <w:sdtPr>
         <w:lock w:val="contentLocked"/>
-        <w:id w:val="1876830169"/>
+        <w:id w:val="-1959536540"/>
         <w:tag w:val="goog_rdk_4"/>
       </w:sdtPr>
       <w:sdtContent>
@@ -5129,7 +5132,7 @@
         <w:jc w:val="left"/>
         <w:rPr/>
       </w:pPr>
-      <w:bookmarkStart w:colFirst="0" w:colLast="0" w:name="_heading=h.e6e6u5wxnfbx" w:id="12"/>
+      <w:bookmarkStart w:colFirst="0" w:colLast="0" w:name="_heading=h.z11qvlfm0rgm" w:id="12"/>
       <w:bookmarkEnd w:id="12"/>
       <w:r>
         <w:rPr>
@@ -5139,20 +5142,16 @@
     </w:p>
     <w:p>
       <w:pPr>
+        <w:rPr/>
+      </w:pPr>
+      <w:r>
         <w:rPr>
           <w:b w:val="1"/>
-          <w:sz w:val="32"/>
-          <w:szCs w:val="32"/>
-        </w:rPr>
-      </w:pPr>
-      <w:r>
-        <w:rPr>
-          <w:b w:val="1"/>
-          <w:sz w:val="32"/>
-          <w:szCs w:val="32"/>
-          <w:rtl w:val="0"/>
-        </w:rPr>
-        <w:t xml:space="preserve">Sprint 5: Modulo de donantes</w:t>
+          <w:sz w:val="28"/>
+          <w:szCs w:val="28"/>
+          <w:rtl w:val="0"/>
+        </w:rPr>
+        <w:t xml:space="preserve">Sprint 5: Módulo de paciente y pase de visita.</w:t>
       </w:r>
       <w:r>
         <w:rPr>
@@ -5166,24 +5165,13 @@
         <w:jc w:val="left"/>
         <w:rPr/>
       </w:pPr>
-      <w:bookmarkStart w:colFirst="0" w:colLast="0" w:name="_heading=h.303bc6cm3yj6" w:id="13"/>
+      <w:bookmarkStart w:colFirst="0" w:colLast="0" w:name="_heading=h.xibfdvucm9i4" w:id="13"/>
       <w:bookmarkEnd w:id="13"/>
       <w:r>
         <w:rPr>
           <w:rtl w:val="0"/>
         </w:rPr>
-        <w:t xml:space="preserve">Historia de Usuario 12: </w:t>
-      </w:r>
-      <w:r>
-        <w:rPr>
-          <w:rtl w:val="0"/>
-        </w:rPr>
-        <w:t xml:space="preserve">Registrar donantes externas</w:t>
-      </w:r>
-      <w:r>
-        <w:rPr>
-          <w:rtl w:val="0"/>
-        </w:rPr>
+        <w:t xml:space="preserve">Historia de Usuario 12: Interfaz para clasificación de pacientes por área.</w:t>
       </w:r>
     </w:p>
     <w:p>
@@ -5201,24 +5189,13 @@
         <w:rPr>
           <w:rtl w:val="0"/>
         </w:rPr>
-        <w:t xml:space="preserve">Como usuario deseo registrar datos completos de donadoras externas.</w:t>
-      </w:r>
-    </w:p>
-    <w:p>
-      <w:pPr>
-        <w:rPr/>
-      </w:pPr>
-      <w:r>
-        <w:rPr>
-          <w:rtl w:val="0"/>
-        </w:rPr>
-        <w:t xml:space="preserve">Tareas:</w:t>
+        <w:t xml:space="preserve">Como usuario deseo filtrar a los pacientes por Área (UCIN, UCI Quirúrgico, Intermedio y Engorde ) en sus respectivas tablas.</w:t>
       </w:r>
     </w:p>
     <w:sdt>
       <w:sdtPr>
         <w:lock w:val="contentLocked"/>
-        <w:id w:val="-1191347806"/>
+        <w:id w:val="-1918650082"/>
         <w:tag w:val="goog_rdk_5"/>
       </w:sdtPr>
       <w:sdtContent>
@@ -5359,7 +5336,7 @@
                   <w:rPr>
                     <w:rtl w:val="0"/>
                   </w:rPr>
-                  <w:t xml:space="preserve">Crear el diseño para el registro de paciente</w:t>
+                  <w:t xml:space="preserve">Crear el diseño para administrar pacientes.</w:t>
                 </w:r>
               </w:p>
             </w:tc>
@@ -5435,7 +5412,7 @@
                   <w:rPr>
                     <w:rtl w:val="0"/>
                   </w:rPr>
-                  <w:t xml:space="preserve">Crear el modulo para el registro de datos</w:t>
+                  <w:t xml:space="preserve">Crear el módulo e implementar lógica para realizar el filtrado.</w:t>
                 </w:r>
               </w:p>
             </w:tc>
@@ -5511,7 +5488,7 @@
                   <w:rPr>
                     <w:rtl w:val="0"/>
                   </w:rPr>
-                  <w:t xml:space="preserve">Crear endpoints para almacenar.</w:t>
+                  <w:t xml:space="preserve">Crear endpoints que devuelvan la información del área en la que se encuentra el paciente.</w:t>
                 </w:r>
               </w:p>
             </w:tc>
@@ -5565,9 +5542,11 @@
       <w:pPr>
         <w:pStyle w:val="Heading2"/>
         <w:jc w:val="left"/>
-        <w:rPr/>
-      </w:pPr>
-      <w:bookmarkStart w:colFirst="0" w:colLast="0" w:name="_heading=h.fbqyg9itb4ls" w:id="14"/>
+        <w:rPr>
+          <w:b w:val="0"/>
+        </w:rPr>
+      </w:pPr>
+      <w:bookmarkStart w:colFirst="0" w:colLast="0" w:name="_heading=h.srqmvqxn5zc8" w:id="14"/>
       <w:bookmarkEnd w:id="14"/>
       <w:r>
         <w:rPr>
@@ -5581,24 +5560,13 @@
         <w:jc w:val="left"/>
         <w:rPr/>
       </w:pPr>
-      <w:bookmarkStart w:colFirst="0" w:colLast="0" w:name="_heading=h.g4d52zn4zuz6" w:id="15"/>
+      <w:bookmarkStart w:colFirst="0" w:colLast="0" w:name="_heading=h.msln7lwyjaoh" w:id="15"/>
       <w:bookmarkEnd w:id="15"/>
       <w:r>
         <w:rPr>
           <w:rtl w:val="0"/>
         </w:rPr>
-        <w:t xml:space="preserve">Historia de Usuario 13: </w:t>
-      </w:r>
-      <w:r>
-        <w:rPr>
-          <w:rtl w:val="0"/>
-        </w:rPr>
-        <w:t xml:space="preserve">Mantener historial de donaciones</w:t>
-      </w:r>
-      <w:r>
-        <w:rPr>
-          <w:rtl w:val="0"/>
-        </w:rPr>
+        <w:t xml:space="preserve">-..Historia de Usuario 13: Registrar pases de visita médica</w:t>
       </w:r>
     </w:p>
     <w:p>
@@ -5616,13 +5584,13 @@
         <w:rPr>
           <w:rtl w:val="0"/>
         </w:rPr>
-        <w:t xml:space="preserve">Como usuario deseo mantener un historial de donaciones por donadora.</w:t>
+        <w:t xml:space="preserve">Como usuario deseo registrar pases de visita médica.</w:t>
       </w:r>
     </w:p>
     <w:sdt>
       <w:sdtPr>
         <w:lock w:val="contentLocked"/>
-        <w:id w:val="-1514538586"/>
+        <w:id w:val="-1854175891"/>
         <w:tag w:val="goog_rdk_6"/>
       </w:sdtPr>
       <w:sdtContent>
@@ -5763,7 +5731,7 @@
                   <w:rPr>
                     <w:rtl w:val="0"/>
                   </w:rPr>
-                  <w:t xml:space="preserve">Crear el diseño para el registro de donaciones </w:t>
+                  <w:t xml:space="preserve">Crear el formulario para el registro </w:t>
                 </w:r>
               </w:p>
             </w:tc>
@@ -5791,7 +5759,7 @@
                   <w:rPr>
                     <w:rtl w:val="0"/>
                   </w:rPr>
-                  <w:t xml:space="preserve">6</w:t>
+                  <w:t xml:space="preserve">8</w:t>
                 </w:r>
               </w:p>
             </w:tc>
@@ -5839,7 +5807,7 @@
                   <w:rPr>
                     <w:rtl w:val="0"/>
                   </w:rPr>
-                  <w:t xml:space="preserve">Crear el módulo para el registro de donaciones y historial </w:t>
+                  <w:t xml:space="preserve">Crear el módulo e implementar lógica para el registro de pases de visita</w:t>
                 </w:r>
               </w:p>
             </w:tc>
@@ -5915,7 +5883,7 @@
                   <w:rPr>
                     <w:rtl w:val="0"/>
                   </w:rPr>
-                  <w:t xml:space="preserve">Crear endpoints para almacenar donaciones y mostrar registros previos.</w:t>
+                  <w:t xml:space="preserve">Crear endpoints para almacenar los datos guardados para el pase de visita</w:t>
                 </w:r>
               </w:p>
             </w:tc>
@@ -5971,24 +5939,8 @@
         <w:jc w:val="left"/>
         <w:rPr/>
       </w:pPr>
-      <w:bookmarkStart w:colFirst="0" w:colLast="0" w:name="_heading=h.onmmmvpoqzwy" w:id="16"/>
+      <w:bookmarkStart w:colFirst="0" w:colLast="0" w:name="_heading=h.cyzi8jz0ft77" w:id="16"/>
       <w:bookmarkEnd w:id="16"/>
-      <w:r>
-        <w:rPr>
-          <w:rtl w:val="0"/>
-        </w:rPr>
-      </w:r>
-    </w:p>
-    <w:p>
-      <w:pPr>
-        <w:rPr/>
-      </w:pPr>
-      <w:r>
-        <w:rPr>
-          <w:rtl w:val="0"/>
-        </w:rPr>
-        <w:t xml:space="preserve">Sprint 6: Modulo de paciente y pase de visita.</w:t>
-      </w:r>
       <w:r>
         <w:rPr>
           <w:rtl w:val="0"/>
@@ -6001,13 +5953,13 @@
         <w:jc w:val="left"/>
         <w:rPr/>
       </w:pPr>
-      <w:bookmarkStart w:colFirst="0" w:colLast="0" w:name="_heading=h.xibfdvucm9i4" w:id="17"/>
+      <w:bookmarkStart w:colFirst="0" w:colLast="0" w:name="_heading=h.ldql6n7as01v" w:id="17"/>
       <w:bookmarkEnd w:id="17"/>
       <w:r>
         <w:rPr>
           <w:rtl w:val="0"/>
         </w:rPr>
-        <w:t xml:space="preserve">Historia de Usuario 14: Interfaz para clasificación de pacientes por área.</w:t>
+        <w:t xml:space="preserve">Historia de Usuario 14 :Extracción de datos de pase de visita.</w:t>
       </w:r>
     </w:p>
     <w:p>
@@ -6025,13 +5977,13 @@
         <w:rPr>
           <w:rtl w:val="0"/>
         </w:rPr>
-        <w:t xml:space="preserve">Como usuario deseo filtrar a los pacientes por Área (UCIN, UCI Quirúrgico, Intermedio y Engorde ) en sus respectivas tablas.</w:t>
+        <w:t xml:space="preserve">Como usuario deseo vincular la información de los pases de visita en el formulario de dispensación.</w:t>
       </w:r>
     </w:p>
     <w:sdt>
       <w:sdtPr>
         <w:lock w:val="contentLocked"/>
-        <w:id w:val="1602816481"/>
+        <w:id w:val="-942900010"/>
         <w:tag w:val="goog_rdk_7"/>
       </w:sdtPr>
       <w:sdtContent>
@@ -6172,7 +6124,7 @@
                   <w:rPr>
                     <w:rtl w:val="0"/>
                   </w:rPr>
-                  <w:t xml:space="preserve">Crear el diseño para administrar pacientes.</w:t>
+                  <w:t xml:space="preserve">Crear el formulario para el registro </w:t>
                 </w:r>
               </w:p>
             </w:tc>
@@ -6248,7 +6200,7 @@
                   <w:rPr>
                     <w:rtl w:val="0"/>
                   </w:rPr>
-                  <w:t xml:space="preserve">Crear el módulo e implementar lógica para realizar el filtrado.</w:t>
+                  <w:t xml:space="preserve">Crear el módulo e implementar lógica para el registro de pases de visita</w:t>
                 </w:r>
               </w:p>
             </w:tc>
@@ -6324,7 +6276,7 @@
                   <w:rPr>
                     <w:rtl w:val="0"/>
                   </w:rPr>
-                  <w:t xml:space="preserve">Crear endpoints que devuelvan la información del área en la que se encuentra el paciente.</w:t>
+                  <w:t xml:space="preserve">Crear endpoints para almacenar los datos guardados para el pase de visita</w:t>
                 </w:r>
               </w:p>
             </w:tc>
@@ -6378,12 +6330,43 @@
       <w:pPr>
         <w:pStyle w:val="Heading2"/>
         <w:jc w:val="left"/>
-        <w:rPr>
-          <w:b w:val="0"/>
-        </w:rPr>
-      </w:pPr>
-      <w:bookmarkStart w:colFirst="0" w:colLast="0" w:name="_heading=h.srqmvqxn5zc8" w:id="18"/>
+        <w:rPr/>
+      </w:pPr>
+      <w:bookmarkStart w:colFirst="0" w:colLast="0" w:name="_heading=h.2wfksr1hzd4b" w:id="18"/>
       <w:bookmarkEnd w:id="18"/>
+      <w:r>
+        <w:rPr>
+          <w:rtl w:val="0"/>
+        </w:rPr>
+      </w:r>
+    </w:p>
+    <w:p>
+      <w:pPr>
+        <w:rPr/>
+      </w:pPr>
+      <w:r>
+        <w:rPr>
+          <w:rtl w:val="0"/>
+        </w:rPr>
+      </w:r>
+    </w:p>
+    <w:p>
+      <w:pPr>
+        <w:rPr>
+          <w:b w:val="1"/>
+          <w:sz w:val="32"/>
+          <w:szCs w:val="32"/>
+        </w:rPr>
+      </w:pPr>
+      <w:r>
+        <w:rPr>
+          <w:b w:val="1"/>
+          <w:sz w:val="32"/>
+          <w:szCs w:val="32"/>
+          <w:rtl w:val="0"/>
+        </w:rPr>
+        <w:t xml:space="preserve">Sprint 6: Módulo de donantes</w:t>
+      </w:r>
       <w:r>
         <w:rPr>
           <w:rtl w:val="0"/>
@@ -6396,7 +6379,7 @@
         <w:jc w:val="left"/>
         <w:rPr/>
       </w:pPr>
-      <w:bookmarkStart w:colFirst="0" w:colLast="0" w:name="_heading=h.msln7lwyjaoh" w:id="19"/>
+      <w:bookmarkStart w:colFirst="0" w:colLast="0" w:name="_heading=h.303bc6cm3yj6" w:id="19"/>
       <w:bookmarkEnd w:id="19"/>
       <w:r>
         <w:rPr>
@@ -6408,7 +6391,7 @@
         <w:rPr>
           <w:rtl w:val="0"/>
         </w:rPr>
-        <w:t xml:space="preserve">Registrar pases de visita médica</w:t>
+        <w:t xml:space="preserve">Registrar donantes externas</w:t>
       </w:r>
       <w:r>
         <w:rPr>
@@ -6431,13 +6414,24 @@
         <w:rPr>
           <w:rtl w:val="0"/>
         </w:rPr>
-        <w:t xml:space="preserve">Como usuario deseo registrar pases de visita médica.</w:t>
+        <w:t xml:space="preserve">Como usuario deseo registrar datos completos de donadoras externas.</w:t>
+      </w:r>
+    </w:p>
+    <w:p>
+      <w:pPr>
+        <w:rPr/>
+      </w:pPr>
+      <w:r>
+        <w:rPr>
+          <w:rtl w:val="0"/>
+        </w:rPr>
+        <w:t xml:space="preserve">Tareas:</w:t>
       </w:r>
     </w:p>
     <w:sdt>
       <w:sdtPr>
         <w:lock w:val="contentLocked"/>
-        <w:id w:val="1771178557"/>
+        <w:id w:val="944528472"/>
         <w:tag w:val="goog_rdk_8"/>
       </w:sdtPr>
       <w:sdtContent>
@@ -6578,7 +6572,7 @@
                   <w:rPr>
                     <w:rtl w:val="0"/>
                   </w:rPr>
-                  <w:t xml:space="preserve">Crear el formulario para el registro </w:t>
+                  <w:t xml:space="preserve">Crear el diseño para el registro de paciente</w:t>
                 </w:r>
               </w:p>
             </w:tc>
@@ -6654,7 +6648,7 @@
                   <w:rPr>
                     <w:rtl w:val="0"/>
                   </w:rPr>
-                  <w:t xml:space="preserve">Crear el módulo e implementar lógica para el registro de pases de visita</w:t>
+                  <w:t xml:space="preserve">Crear el modulo para el registro de datos</w:t>
                 </w:r>
               </w:p>
             </w:tc>
@@ -6730,7 +6724,7 @@
                   <w:rPr>
                     <w:rtl w:val="0"/>
                   </w:rPr>
-                  <w:t xml:space="preserve">Crear endpoints para almacenar los datos guardados para el pase de visita</w:t>
+                  <w:t xml:space="preserve">Crear endpoints para almacenar.</w:t>
                 </w:r>
               </w:p>
             </w:tc>
@@ -6786,7 +6780,7 @@
         <w:jc w:val="left"/>
         <w:rPr/>
       </w:pPr>
-      <w:bookmarkStart w:colFirst="0" w:colLast="0" w:name="_heading=h.cyzi8jz0ft77" w:id="20"/>
+      <w:bookmarkStart w:colFirst="0" w:colLast="0" w:name="_heading=h.fbqyg9itb4ls" w:id="20"/>
       <w:bookmarkEnd w:id="20"/>
       <w:r>
         <w:rPr>
@@ -6800,13 +6794,24 @@
         <w:jc w:val="left"/>
         <w:rPr/>
       </w:pPr>
-      <w:bookmarkStart w:colFirst="0" w:colLast="0" w:name="_heading=h.ldql6n7as01v" w:id="21"/>
+      <w:bookmarkStart w:colFirst="0" w:colLast="0" w:name="_heading=h.g4d52zn4zuz6" w:id="21"/>
       <w:bookmarkEnd w:id="21"/>
       <w:r>
         <w:rPr>
           <w:rtl w:val="0"/>
         </w:rPr>
-        <w:t xml:space="preserve">Historia de Usuario 16:Extracción de datos de pase de visita.</w:t>
+        <w:t xml:space="preserve">Historia de Usuario 16: </w:t>
+      </w:r>
+      <w:r>
+        <w:rPr>
+          <w:rtl w:val="0"/>
+        </w:rPr>
+        <w:t xml:space="preserve">Mantener historial de donaciones</w:t>
+      </w:r>
+      <w:r>
+        <w:rPr>
+          <w:rtl w:val="0"/>
+        </w:rPr>
       </w:r>
     </w:p>
     <w:p>
@@ -6824,13 +6829,13 @@
         <w:rPr>
           <w:rtl w:val="0"/>
         </w:rPr>
-        <w:t xml:space="preserve">Como usuario deseo vincular la información de los pases de visita en el formulario de dispensación.</w:t>
+        <w:t xml:space="preserve">Como usuario deseo mantener un historial de donaciones por donadora.</w:t>
       </w:r>
     </w:p>
     <w:sdt>
       <w:sdtPr>
         <w:lock w:val="contentLocked"/>
-        <w:id w:val="-1941732701"/>
+        <w:id w:val="-1389709539"/>
         <w:tag w:val="goog_rdk_9"/>
       </w:sdtPr>
       <w:sdtContent>
@@ -6971,7 +6976,7 @@
                   <w:rPr>
                     <w:rtl w:val="0"/>
                   </w:rPr>
-                  <w:t xml:space="preserve">Crear el formulario para el registro </w:t>
+                  <w:t xml:space="preserve">Crear el diseño para el registro de donaciones </w:t>
                 </w:r>
               </w:p>
             </w:tc>
@@ -6999,7 +7004,7 @@
                   <w:rPr>
                     <w:rtl w:val="0"/>
                   </w:rPr>
-                  <w:t xml:space="preserve">8</w:t>
+                  <w:t xml:space="preserve">6</w:t>
                 </w:r>
               </w:p>
             </w:tc>
@@ -7047,7 +7052,7 @@
                   <w:rPr>
                     <w:rtl w:val="0"/>
                   </w:rPr>
-                  <w:t xml:space="preserve">Crear el módulo e implementar lógica para el registro de pases de visita</w:t>
+                  <w:t xml:space="preserve">Crear el módulo para el registro de donaciones y historial </w:t>
                 </w:r>
               </w:p>
             </w:tc>
@@ -7123,7 +7128,7 @@
                   <w:rPr>
                     <w:rtl w:val="0"/>
                   </w:rPr>
-                  <w:t xml:space="preserve">Crear endpoints para almacenar los datos guardados para el pase de visita</w:t>
+                  <w:t xml:space="preserve">Crear endpoints para almacenar donaciones y mostrar registros previos.</w:t>
                 </w:r>
               </w:p>
             </w:tc>
@@ -7179,31 +7184,8 @@
         <w:jc w:val="left"/>
         <w:rPr/>
       </w:pPr>
-      <w:bookmarkStart w:colFirst="0" w:colLast="0" w:name="_heading=h.q68tliwxx66q" w:id="22"/>
+      <w:bookmarkStart w:colFirst="0" w:colLast="0" w:name="_heading=h.onmmmvpoqzwy" w:id="22"/>
       <w:bookmarkEnd w:id="22"/>
-      <w:r>
-        <w:rPr>
-          <w:rtl w:val="0"/>
-        </w:rPr>
-      </w:r>
-    </w:p>
-    <w:p>
-      <w:pPr>
-        <w:rPr/>
-      </w:pPr>
-      <w:r>
-        <w:rPr>
-          <w:b w:val="1"/>
-          <w:rtl w:val="0"/>
-        </w:rPr>
-        <w:t xml:space="preserve">Sprint </w:t>
-      </w:r>
-      <w:r>
-        <w:rPr>
-          <w:rtl w:val="0"/>
-        </w:rPr>
-        <w:t xml:space="preserve">7: Modulo de reportes</w:t>
-      </w:r>
       <w:r>
         <w:rPr>
           <w:rtl w:val="0"/>
@@ -7216,8 +7198,41 @@
         <w:jc w:val="left"/>
         <w:rPr/>
       </w:pPr>
-      <w:bookmarkStart w:colFirst="0" w:colLast="0" w:name="_heading=h.cpu7011wp1ld" w:id="23"/>
+      <w:bookmarkStart w:colFirst="0" w:colLast="0" w:name="_heading=h.q68tliwxx66q" w:id="23"/>
       <w:bookmarkEnd w:id="23"/>
+      <w:r>
+        <w:rPr>
+          <w:rtl w:val="0"/>
+        </w:rPr>
+      </w:r>
+    </w:p>
+    <w:p>
+      <w:pPr>
+        <w:rPr>
+          <w:b w:val="1"/>
+        </w:rPr>
+      </w:pPr>
+      <w:r>
+        <w:rPr>
+          <w:b w:val="1"/>
+          <w:rtl w:val="0"/>
+        </w:rPr>
+        <w:t xml:space="preserve">Sprint 7: Modulo de reportes</w:t>
+      </w:r>
+      <w:r>
+        <w:rPr>
+          <w:rtl w:val="0"/>
+        </w:rPr>
+      </w:r>
+    </w:p>
+    <w:p>
+      <w:pPr>
+        <w:pStyle w:val="Heading2"/>
+        <w:jc w:val="left"/>
+        <w:rPr/>
+      </w:pPr>
+      <w:bookmarkStart w:colFirst="0" w:colLast="0" w:name="_heading=h.cpu7011wp1ld" w:id="24"/>
+      <w:bookmarkEnd w:id="24"/>
       <w:r>
         <w:rPr>
           <w:rtl w:val="0"/>
@@ -7257,7 +7272,7 @@
     <w:sdt>
       <w:sdtPr>
         <w:lock w:val="contentLocked"/>
-        <w:id w:val="1447942161"/>
+        <w:id w:val="1042846832"/>
         <w:tag w:val="goog_rdk_10"/>
       </w:sdtPr>
       <w:sdtContent>
@@ -7606,8 +7621,8 @@
         <w:jc w:val="left"/>
         <w:rPr/>
       </w:pPr>
-      <w:bookmarkStart w:colFirst="0" w:colLast="0" w:name="_heading=h.4m5stnlmnhpa" w:id="24"/>
-      <w:bookmarkEnd w:id="24"/>
+      <w:bookmarkStart w:colFirst="0" w:colLast="0" w:name="_heading=h.4m5stnlmnhpa" w:id="25"/>
+      <w:bookmarkEnd w:id="25"/>
       <w:r>
         <w:rPr>
           <w:rtl w:val="0"/>
@@ -7620,8 +7635,8 @@
         <w:jc w:val="left"/>
         <w:rPr/>
       </w:pPr>
-      <w:bookmarkStart w:colFirst="0" w:colLast="0" w:name="_heading=h.71nvohv3bs" w:id="25"/>
-      <w:bookmarkEnd w:id="25"/>
+      <w:bookmarkStart w:colFirst="0" w:colLast="0" w:name="_heading=h.71nvohv3bs" w:id="26"/>
+      <w:bookmarkEnd w:id="26"/>
       <w:r>
         <w:rPr>
           <w:rtl w:val="0"/>
@@ -7661,7 +7676,7 @@
     <w:sdt>
       <w:sdtPr>
         <w:lock w:val="contentLocked"/>
-        <w:id w:val="-1604676774"/>
+        <w:id w:val="961737058"/>
         <w:tag w:val="goog_rdk_11"/>
       </w:sdtPr>
       <w:sdtContent>
@@ -8010,8 +8025,8 @@
         <w:jc w:val="left"/>
         <w:rPr/>
       </w:pPr>
-      <w:bookmarkStart w:colFirst="0" w:colLast="0" w:name="_heading=h.7r28oex1v9nn" w:id="26"/>
-      <w:bookmarkEnd w:id="26"/>
+      <w:bookmarkStart w:colFirst="0" w:colLast="0" w:name="_heading=h.7r28oex1v9nn" w:id="27"/>
+      <w:bookmarkEnd w:id="27"/>
       <w:r>
         <w:rPr>
           <w:rtl w:val="0"/>
@@ -8024,8 +8039,8 @@
         <w:jc w:val="left"/>
         <w:rPr/>
       </w:pPr>
-      <w:bookmarkStart w:colFirst="0" w:colLast="0" w:name="_heading=h.fqr990nb6j8s" w:id="27"/>
-      <w:bookmarkEnd w:id="27"/>
+      <w:bookmarkStart w:colFirst="0" w:colLast="0" w:name="_heading=h.fqr990nb6j8s" w:id="28"/>
+      <w:bookmarkEnd w:id="28"/>
       <w:r>
         <w:rPr>
           <w:rtl w:val="0"/>
@@ -8065,7 +8080,7 @@
     <w:sdt>
       <w:sdtPr>
         <w:lock w:val="contentLocked"/>
-        <w:id w:val="232308030"/>
+        <w:id w:val="-2140250534"/>
         <w:tag w:val="goog_rdk_12"/>
       </w:sdtPr>
       <w:sdtContent>
@@ -8414,8 +8429,8 @@
         <w:jc w:val="left"/>
         <w:rPr/>
       </w:pPr>
-      <w:bookmarkStart w:colFirst="0" w:colLast="0" w:name="_heading=h.plgjtoafxfv9" w:id="28"/>
-      <w:bookmarkEnd w:id="28"/>
+      <w:bookmarkStart w:colFirst="0" w:colLast="0" w:name="_heading=h.plgjtoafxfv9" w:id="29"/>
+      <w:bookmarkEnd w:id="29"/>
       <w:r>
         <w:rPr>
           <w:rtl w:val="0"/>
@@ -10956,7 +10971,7 @@
 
 <file path=customXML/item1.xml><?xml version="1.0" encoding="utf-8"?>
 <go:gDocsCustomXmlDataStorage xmlns:go="http://customooxmlschemas.google.com/" xmlns:r="http://schemas.openxmlformats.org/officeDocument/2006/relationships" uri="GoogleDocsCustomDataVersion2">
-  <go:docsCustomData xmlns:go="http://customooxmlschemas.google.com/" roundtripDataSignature="AMtx7mjpfCIo5xY5AgXqWkXN6neiyDdV4g==">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</go:docsCustomData>
+  <go:docsCustomData xmlns:go="http://customooxmlschemas.google.com/" roundtripDataSignature="AMtx7mj35UATdALO+0qCBThjBQ6IOGAs3A==">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</go:docsCustomData>
 </go:gDocsCustomXmlDataStorage>
 </file>
 

</xml_diff>

<commit_message>
actualización del product backlog
</commit_message>
<xml_diff>
--- a/TP2. E4 Sprint Backlog con tareas y estimaciones.docx
+++ b/TP2. E4 Sprint Backlog con tareas y estimaciones.docx
@@ -5390,18 +5390,58 @@
         <w:jc w:val="left"/>
       </w:pPr>
       <w:r>
-        <w:t>Historia de Usuario 14: Generar códigos únicos de trazabilidad</w:t>
+        <w:t xml:space="preserve">Historia de Usuario 14: </w:t>
+      </w:r>
+      <w:r>
+        <w:t>Implementar selección múltiple de leches con diferenciación visual</w:t>
       </w:r>
     </w:p>
     <w:p>
-      <w:r>
+      <w:pPr>
+        <w:pStyle w:val="Ttulo2"/>
+        <w:jc w:val="left"/>
         <w:rPr>
-          <w:b/>
+          <w:b w:val="0"/>
+          <w:bCs/>
+          <w:sz w:val="24"/>
+          <w:szCs w:val="24"/>
         </w:rPr>
-        <w:t>Descripción:</w:t>
-      </w:r>
-      <w:r>
-        <w:t xml:space="preserve"> Como usuario deseo generar códigos de trazabilidad únicos para cada dispensación que se registren en la base de datos.</w:t>
+      </w:pPr>
+      <w:r>
+        <w:rPr>
+          <w:b w:val="0"/>
+          <w:bCs/>
+          <w:sz w:val="24"/>
+          <w:szCs w:val="24"/>
+        </w:rPr>
+        <w:t xml:space="preserve">Descripción: </w:t>
+      </w:r>
+      <w:r>
+        <w:rPr>
+          <w:b w:val="0"/>
+          <w:bCs/>
+          <w:sz w:val="24"/>
+          <w:szCs w:val="24"/>
+        </w:rPr>
+        <w:t>Como usuario</w:t>
+      </w:r>
+      <w:r>
+        <w:rPr>
+          <w:b w:val="0"/>
+          <w:bCs/>
+          <w:sz w:val="24"/>
+          <w:szCs w:val="24"/>
+        </w:rPr>
+        <w:t xml:space="preserve">, </w:t>
+      </w:r>
+      <w:r>
+        <w:rPr>
+          <w:b w:val="0"/>
+          <w:bCs/>
+          <w:sz w:val="24"/>
+          <w:szCs w:val="24"/>
+        </w:rPr>
+        <w:t>quiero poder seleccionar múltiples tipos de leche para una misma toma o dispensación, para así registrar correctamente una alimentación mixta.</w:t>
       </w:r>
     </w:p>
     <w:p>
@@ -8549,7 +8589,6 @@
   <w:style w:type="character" w:default="1" w:styleId="Fuentedeprrafopredeter">
     <w:name w:val="Default Paragraph Font"/>
     <w:uiPriority w:val="1"/>
-    <w:semiHidden/>
     <w:unhideWhenUsed/>
   </w:style>
   <w:style w:type="table" w:default="1" w:styleId="Tablanormal">

</xml_diff>